<commit_message>
feat: add new generation scripts for user manual and poster; update package.json to include commands for generating user manual and poster, enhancing documentation capabilities of the project
</commit_message>
<xml_diff>
--- a/docs/thesis/Chapter-03-Design.docx
+++ b/docs/thesis/Chapter-03-Design.docx
@@ -304,47 +304,7 @@
           <w:sz w:val="24"/>
           <w:szCs w:val="24"/>
         </w:rPr>
-        <w:t xml:space="preserve">class </w:t>
-      </w:r>
-      <w:r>
-        <w:rPr>
-          <w:rFonts w:ascii="Iskoola Pota" w:hAnsi="Iskoola Pota" w:cs="Iskoola Pota" w:eastAsia="Iskoola Pota"/>
-          <w:b w:val="0"/>
-          <w:color w:val="000000"/>
-          <w:sz w:val="24"/>
-          <w:szCs w:val="24"/>
-        </w:rPr>
-        <w:t xml:space="preserve">සහ </w:t>
-      </w:r>
-      <w:r>
-        <w:rPr>
-          <w:rFonts w:ascii="Times New Roman" w:hAnsi="Times New Roman" w:cs="Times New Roman" w:eastAsia="Times New Roman"/>
-          <w:b w:val="0"/>
-          <w:color w:val="000000"/>
-          <w:sz w:val="24"/>
-          <w:szCs w:val="24"/>
-        </w:rPr>
-        <w:t xml:space="preserve">ER </w:t>
-      </w:r>
-      <w:r>
-        <w:rPr>
-          <w:rFonts w:ascii="Iskoola Pota" w:hAnsi="Iskoola Pota" w:cs="Iskoola Pota" w:eastAsia="Iskoola Pota"/>
-          <w:b w:val="0"/>
-          <w:color w:val="000000"/>
-          <w:sz w:val="24"/>
-          <w:szCs w:val="24"/>
-        </w:rPr>
-        <w:t xml:space="preserve">ආකෘති, </w:t>
-      </w:r>
-      <w:r>
-        <w:rPr>
-          <w:rFonts w:ascii="Times New Roman" w:hAnsi="Times New Roman" w:cs="Times New Roman" w:eastAsia="Times New Roman"/>
-          <w:b w:val="0"/>
-          <w:color w:val="000000"/>
-          <w:sz w:val="24"/>
-          <w:szCs w:val="24"/>
-        </w:rPr>
-        <w:t xml:space="preserve">UI </w:t>
+        <w:t xml:space="preserve">class diagram, UI </w:t>
       </w:r>
       <w:r>
         <w:rPr>
@@ -1084,37 +1044,17 @@
           <w:sz w:val="24"/>
           <w:szCs w:val="24"/>
         </w:rPr>
-        <w:t xml:space="preserve">Class </w:t>
-      </w:r>
-      <w:r>
-        <w:rPr>
-          <w:rFonts w:ascii="Iskoola Pota" w:hAnsi="Iskoola Pota" w:cs="Iskoola Pota" w:eastAsia="Iskoola Pota"/>
-          <w:b w:val="0"/>
-          <w:color w:val="000000"/>
-          <w:sz w:val="24"/>
-          <w:szCs w:val="24"/>
-        </w:rPr>
-        <w:t xml:space="preserve">සහ </w:t>
-      </w:r>
-      <w:r>
-        <w:rPr>
-          <w:rFonts w:ascii="Times New Roman" w:hAnsi="Times New Roman" w:cs="Times New Roman" w:eastAsia="Times New Roman"/>
-          <w:b w:val="0"/>
-          <w:color w:val="000000"/>
-          <w:sz w:val="24"/>
-          <w:szCs w:val="24"/>
-        </w:rPr>
-        <w:t xml:space="preserve">ER </w:t>
-      </w:r>
-      <w:r>
-        <w:rPr>
-          <w:rFonts w:ascii="Iskoola Pota" w:hAnsi="Iskoola Pota" w:cs="Iskoola Pota" w:eastAsia="Iskoola Pota"/>
-          <w:b w:val="0"/>
-          <w:color w:val="000000"/>
-          <w:sz w:val="24"/>
-          <w:szCs w:val="24"/>
-        </w:rPr>
-        <w:t xml:space="preserve">ආකෘති, කොටස 3.5 අතුරුමුහුණත් නිර්මාණය, කොටස 3.6 තාක්ෂණ </w:t>
+        <w:t xml:space="preserve">Class diagram, </w:t>
+      </w:r>
+      <w:r>
+        <w:rPr>
+          <w:rFonts w:ascii="Iskoola Pota" w:hAnsi="Iskoola Pota" w:cs="Iskoola Pota" w:eastAsia="Iskoola Pota"/>
+          <w:b w:val="0"/>
+          <w:color w:val="000000"/>
+          <w:sz w:val="24"/>
+          <w:szCs w:val="24"/>
+        </w:rPr>
+        <w:t xml:space="preserve">කොටස 3.5 අතුරුමුහුණත් නිර්මාණය, කොටස 3.6 තාක්ෂණ </w:t>
       </w:r>
       <w:r>
         <w:rPr>
@@ -5826,29 +5766,7 @@
           <w:szCs w:val="28"/>
           <w:bCs/>
         </w:rPr>
-        <w:t xml:space="preserve">3.4 Class diagram </w:t>
-      </w:r>
-      <w:r>
-        <w:rPr>
-          <w:rFonts w:ascii="Iskoola Pota" w:hAnsi="Iskoola Pota" w:cs="Iskoola Pota" w:eastAsia="Iskoola Pota"/>
-          <w:b/>
-          <w:color w:val="000000"/>
-          <w:sz w:val="28"/>
-          <w:szCs w:val="28"/>
-          <w:bCs/>
-        </w:rPr>
-        <w:t xml:space="preserve">සහ </w:t>
-      </w:r>
-      <w:r>
-        <w:rPr>
-          <w:rFonts w:ascii="Times New Roman" w:hAnsi="Times New Roman" w:cs="Times New Roman" w:eastAsia="Times New Roman"/>
-          <w:b/>
-          <w:color w:val="000000"/>
-          <w:sz w:val="28"/>
-          <w:szCs w:val="28"/>
-          <w:bCs/>
-        </w:rPr>
-        <w:t>ER / Data model</w:t>
+        <w:t>3.4 Class diagram / Domain model</w:t>
       </w:r>
     </w:p>
     <w:p>
@@ -5873,7 +5791,7 @@
           <w:sz w:val="24"/>
           <w:szCs w:val="24"/>
         </w:rPr>
-        <w:t xml:space="preserve">domain entities: User, Circular, Summary </w:t>
+        <w:t xml:space="preserve">domain classes: User, Circular, Summary, Entity </w:t>
       </w:r>
       <w:r>
         <w:rPr>
@@ -5893,7 +5811,7 @@
           <w:sz w:val="24"/>
           <w:szCs w:val="24"/>
         </w:rPr>
-        <w:t xml:space="preserve">Entity. User </w:t>
+        <w:t xml:space="preserve">AiServiceClient. User </w:t>
       </w:r>
       <w:r>
         <w:rPr>
@@ -5992,13 +5910,63 @@
       </w:pPr>
       <w:r>
         <w:rPr>
-          <w:rFonts w:ascii="Times New Roman" w:hAnsi="Times New Roman" w:cs="Times New Roman" w:eastAsia="Times New Roman"/>
-          <w:b w:val="0"/>
-          <w:color w:val="000000"/>
-          <w:sz w:val="24"/>
-          <w:szCs w:val="24"/>
-        </w:rPr>
-        <w:t xml:space="preserve">Class diagram </w:t>
+          <w:rFonts w:ascii="Iskoola Pota" w:hAnsi="Iskoola Pota" w:cs="Iskoola Pota" w:eastAsia="Iskoola Pota"/>
+          <w:b w:val="0"/>
+          <w:color w:val="000000"/>
+          <w:sz w:val="24"/>
+          <w:szCs w:val="24"/>
+        </w:rPr>
+        <w:t xml:space="preserve">පහත </w:t>
+      </w:r>
+      <w:r>
+        <w:rPr>
+          <w:rFonts w:ascii="Times New Roman" w:hAnsi="Times New Roman" w:cs="Times New Roman" w:eastAsia="Times New Roman"/>
+          <w:b w:val="0"/>
+          <w:color w:val="000000"/>
+          <w:sz w:val="24"/>
+          <w:szCs w:val="24"/>
+        </w:rPr>
+        <w:t xml:space="preserve">class diagram </w:t>
+      </w:r>
+      <w:r>
+        <w:rPr>
+          <w:rFonts w:ascii="Iskoola Pota" w:hAnsi="Iskoola Pota" w:cs="Iskoola Pota" w:eastAsia="Iskoola Pota"/>
+          <w:b w:val="0"/>
+          <w:color w:val="000000"/>
+          <w:sz w:val="24"/>
+          <w:szCs w:val="24"/>
+        </w:rPr>
+        <w:t xml:space="preserve">මගින් </w:t>
+      </w:r>
+      <w:r>
+        <w:rPr>
+          <w:rFonts w:ascii="Times New Roman" w:hAnsi="Times New Roman" w:cs="Times New Roman" w:eastAsia="Times New Roman"/>
+          <w:b w:val="0"/>
+          <w:color w:val="000000"/>
+          <w:sz w:val="24"/>
+          <w:szCs w:val="24"/>
+        </w:rPr>
+        <w:t xml:space="preserve">EasyCircular domain model </w:t>
+      </w:r>
+      <w:r>
+        <w:rPr>
+          <w:rFonts w:ascii="Iskoola Pota" w:hAnsi="Iskoola Pota" w:cs="Iskoola Pota" w:eastAsia="Iskoola Pota"/>
+          <w:b w:val="0"/>
+          <w:color w:val="000000"/>
+          <w:sz w:val="24"/>
+          <w:szCs w:val="24"/>
+        </w:rPr>
+        <w:t xml:space="preserve">එකේ </w:t>
+      </w:r>
+      <w:r>
+        <w:rPr>
+          <w:rFonts w:ascii="Times New Roman" w:hAnsi="Times New Roman" w:cs="Times New Roman" w:eastAsia="Times New Roman"/>
+          <w:b w:val="0"/>
+          <w:color w:val="000000"/>
+          <w:sz w:val="24"/>
+          <w:szCs w:val="24"/>
+        </w:rPr>
+        <w:t xml:space="preserve">classes, attributes, methods </w:t>
       </w:r>
       <w:r>
         <w:rPr>
@@ -6018,17 +5986,17 @@
           <w:sz w:val="24"/>
           <w:szCs w:val="24"/>
         </w:rPr>
-        <w:t xml:space="preserve">MongoDB ER-style document model </w:t>
-      </w:r>
-      <w:r>
-        <w:rPr>
-          <w:rFonts w:ascii="Iskoola Pota" w:hAnsi="Iskoola Pota" w:cs="Iskoola Pota" w:eastAsia="Iskoola Pota"/>
-          <w:b w:val="0"/>
-          <w:color w:val="000000"/>
-          <w:sz w:val="24"/>
-          <w:szCs w:val="24"/>
-        </w:rPr>
-        <w:t>පහත රූපවලින් පෙන්වයි.</w:t>
+        <w:t xml:space="preserve">associations </w:t>
+      </w:r>
+      <w:r>
+        <w:rPr>
+          <w:rFonts w:ascii="Iskoola Pota" w:hAnsi="Iskoola Pota" w:cs="Iskoola Pota" w:eastAsia="Iskoola Pota"/>
+          <w:b w:val="0"/>
+          <w:color w:val="000000"/>
+          <w:sz w:val="24"/>
+          <w:szCs w:val="24"/>
+        </w:rPr>
+        <w:t>ඉදිරිපත් කෙරේ.</w:t>
       </w:r>
     </w:p>
     <w:p>
@@ -6088,12 +6056,210 @@
     </w:p>
     <w:p>
       <w:pPr>
+        <w:pStyle w:val="Heading2"/>
+        <w:spacing w:before="160" w:after="120"/>
+      </w:pPr>
+      <w:r>
+        <w:rPr>
+          <w:rFonts w:ascii="Iskoola Pota" w:hAnsi="Iskoola Pota" w:cs="Iskoola Pota" w:eastAsia="Iskoola Pota"/>
+          <w:b/>
+          <w:color w:val="000000"/>
+          <w:sz w:val="28"/>
+          <w:szCs w:val="28"/>
+          <w:bCs/>
+        </w:rPr>
+        <w:t xml:space="preserve">3.5 අතුරුමුහුණත් නිර්මාණය / </w:t>
+      </w:r>
+      <w:r>
+        <w:rPr>
+          <w:rFonts w:ascii="Times New Roman" w:hAnsi="Times New Roman" w:cs="Times New Roman" w:eastAsia="Times New Roman"/>
+          <w:b/>
+          <w:color w:val="000000"/>
+          <w:sz w:val="28"/>
+          <w:szCs w:val="28"/>
+          <w:bCs/>
+        </w:rPr>
+        <w:t>Wireframes (UI design)</w:t>
+      </w:r>
+    </w:p>
+    <w:p>
+      <w:pPr>
+        <w:spacing w:lineRule="auto" w:line="360" w:after="120"/>
+      </w:pPr>
+      <w:r>
+        <w:rPr>
+          <w:rFonts w:ascii="Times New Roman" w:hAnsi="Times New Roman" w:cs="Times New Roman" w:eastAsia="Times New Roman"/>
+          <w:b w:val="0"/>
+          <w:color w:val="000000"/>
+          <w:sz w:val="24"/>
+          <w:szCs w:val="24"/>
+        </w:rPr>
+        <w:t xml:space="preserve">UI design primary research </w:t>
+      </w:r>
+      <w:r>
+        <w:rPr>
+          <w:rFonts w:ascii="Iskoola Pota" w:hAnsi="Iskoola Pota" w:cs="Iskoola Pota" w:eastAsia="Iskoola Pota"/>
+          <w:b w:val="0"/>
+          <w:color w:val="000000"/>
+          <w:sz w:val="24"/>
+          <w:szCs w:val="24"/>
+        </w:rPr>
+        <w:t xml:space="preserve">අවශ්‍යතා මත පදනම් විය: සාරාංශය, </w:t>
+      </w:r>
+      <w:r>
+        <w:rPr>
+          <w:rFonts w:ascii="Times New Roman" w:hAnsi="Times New Roman" w:cs="Times New Roman" w:eastAsia="Times New Roman"/>
+          <w:b w:val="0"/>
+          <w:color w:val="000000"/>
+          <w:sz w:val="24"/>
+          <w:szCs w:val="24"/>
+        </w:rPr>
+        <w:t xml:space="preserve">entity highlighting </w:t>
+      </w:r>
+      <w:r>
+        <w:rPr>
+          <w:rFonts w:ascii="Iskoola Pota" w:hAnsi="Iskoola Pota" w:cs="Iskoola Pota" w:eastAsia="Iskoola Pota"/>
+          <w:b w:val="0"/>
+          <w:color w:val="000000"/>
+          <w:sz w:val="24"/>
+          <w:szCs w:val="24"/>
+        </w:rPr>
+        <w:t xml:space="preserve">සහ සරල </w:t>
+      </w:r>
+      <w:r>
+        <w:rPr>
+          <w:rFonts w:ascii="Times New Roman" w:hAnsi="Times New Roman" w:cs="Times New Roman" w:eastAsia="Times New Roman"/>
+          <w:b w:val="0"/>
+          <w:color w:val="000000"/>
+          <w:sz w:val="24"/>
+          <w:szCs w:val="24"/>
+        </w:rPr>
+        <w:t xml:space="preserve">upload workflow. </w:t>
+      </w:r>
+      <w:r>
+        <w:rPr>
+          <w:rFonts w:ascii="Iskoola Pota" w:hAnsi="Iskoola Pota" w:cs="Iskoola Pota" w:eastAsia="Iskoola Pota"/>
+          <w:b w:val="0"/>
+          <w:color w:val="000000"/>
+          <w:sz w:val="24"/>
+          <w:szCs w:val="24"/>
+        </w:rPr>
+        <w:t xml:space="preserve">ප්‍රධාන තිර: </w:t>
+      </w:r>
+      <w:r>
+        <w:rPr>
+          <w:rFonts w:ascii="Times New Roman" w:hAnsi="Times New Roman" w:cs="Times New Roman" w:eastAsia="Times New Roman"/>
+          <w:b w:val="0"/>
+          <w:color w:val="000000"/>
+          <w:sz w:val="24"/>
+          <w:szCs w:val="24"/>
+        </w:rPr>
+        <w:t xml:space="preserve">Sign-in, Dashboard, PDF Upload </w:t>
+      </w:r>
+      <w:r>
+        <w:rPr>
+          <w:rFonts w:ascii="Iskoola Pota" w:hAnsi="Iskoola Pota" w:cs="Iskoola Pota" w:eastAsia="Iskoola Pota"/>
+          <w:b w:val="0"/>
+          <w:color w:val="000000"/>
+          <w:sz w:val="24"/>
+          <w:szCs w:val="24"/>
+        </w:rPr>
+        <w:t xml:space="preserve">සහ </w:t>
+      </w:r>
+      <w:r>
+        <w:rPr>
+          <w:rFonts w:ascii="Times New Roman" w:hAnsi="Times New Roman" w:cs="Times New Roman" w:eastAsia="Times New Roman"/>
+          <w:b w:val="0"/>
+          <w:color w:val="000000"/>
+          <w:sz w:val="24"/>
+          <w:szCs w:val="24"/>
+        </w:rPr>
+        <w:t xml:space="preserve">Library (workspace) </w:t>
+      </w:r>
+      <w:r>
+        <w:rPr>
+          <w:rFonts w:ascii="Iskoola Pota" w:hAnsi="Iskoola Pota" w:cs="Iskoola Pota" w:eastAsia="Iskoola Pota"/>
+          <w:b w:val="0"/>
+          <w:color w:val="000000"/>
+          <w:sz w:val="24"/>
+          <w:szCs w:val="24"/>
+        </w:rPr>
+        <w:t>වේ.</w:t>
+      </w:r>
+    </w:p>
+    <w:p>
+      <w:pPr>
+        <w:spacing w:lineRule="auto" w:line="360" w:after="120"/>
+      </w:pPr>
+      <w:r>
+        <w:rPr>
+          <w:rFonts w:ascii="Times New Roman" w:hAnsi="Times New Roman" w:cs="Times New Roman" w:eastAsia="Times New Roman"/>
+          <w:b w:val="0"/>
+          <w:color w:val="000000"/>
+          <w:sz w:val="24"/>
+          <w:szCs w:val="24"/>
+        </w:rPr>
+        <w:t xml:space="preserve">Human-in-the-loop text edit step </w:t>
+      </w:r>
+      <w:r>
+        <w:rPr>
+          <w:rFonts w:ascii="Iskoola Pota" w:hAnsi="Iskoola Pota" w:cs="Iskoola Pota" w:eastAsia="Iskoola Pota"/>
+          <w:b w:val="0"/>
+          <w:color w:val="000000"/>
+          <w:sz w:val="24"/>
+          <w:szCs w:val="24"/>
+        </w:rPr>
+        <w:t xml:space="preserve">අනිවාර්ය </w:t>
+      </w:r>
+      <w:r>
+        <w:rPr>
+          <w:rFonts w:ascii="Times New Roman" w:hAnsi="Times New Roman" w:cs="Times New Roman" w:eastAsia="Times New Roman"/>
+          <w:b w:val="0"/>
+          <w:color w:val="000000"/>
+          <w:sz w:val="24"/>
+          <w:szCs w:val="24"/>
+        </w:rPr>
+        <w:t xml:space="preserve">UI flow </w:t>
+      </w:r>
+      <w:r>
+        <w:rPr>
+          <w:rFonts w:ascii="Iskoola Pota" w:hAnsi="Iskoola Pota" w:cs="Iskoola Pota" w:eastAsia="Iskoola Pota"/>
+          <w:b w:val="0"/>
+          <w:color w:val="000000"/>
+          <w:sz w:val="24"/>
+          <w:szCs w:val="24"/>
+        </w:rPr>
+        <w:t xml:space="preserve">එකකි. පහත රූප මගින් නිර්මාණය කළ අතුරුමුහුණත් ඉදිරිපත් කර ඇත; ක්‍රියාත්මක කළ සාරාංශ සහ </w:t>
+      </w:r>
+      <w:r>
+        <w:rPr>
+          <w:rFonts w:ascii="Times New Roman" w:hAnsi="Times New Roman" w:cs="Times New Roman" w:eastAsia="Times New Roman"/>
+          <w:b w:val="0"/>
+          <w:color w:val="000000"/>
+          <w:sz w:val="24"/>
+          <w:szCs w:val="24"/>
+        </w:rPr>
+        <w:t xml:space="preserve">entity highlight </w:t>
+      </w:r>
+      <w:r>
+        <w:rPr>
+          <w:rFonts w:ascii="Iskoola Pota" w:hAnsi="Iskoola Pota" w:cs="Iskoola Pota" w:eastAsia="Iskoola Pota"/>
+          <w:b w:val="0"/>
+          <w:color w:val="000000"/>
+          <w:sz w:val="24"/>
+          <w:szCs w:val="24"/>
+        </w:rPr>
+        <w:t>තිර පරිච්ඡේදය 4 කොටස 4.2 හි ඉදිරිපත් වේ.</w:t>
+      </w:r>
+    </w:p>
+    <w:p>
+      <w:pPr>
         <w:jc w:val="center"/>
       </w:pPr>
       <w:r>
         <w:drawing>
           <wp:inline xmlns:a="http://schemas.openxmlformats.org/drawingml/2006/main" xmlns:pic="http://schemas.openxmlformats.org/drawingml/2006/picture">
-            <wp:extent cx="5040000" cy="3240000"/>
+            <wp:extent cx="5040000" cy="3150000"/>
             <wp:docPr id="3" name="Picture 3"/>
             <wp:cNvGraphicFramePr>
               <a:graphicFrameLocks noChangeAspect="1"/>
@@ -6102,7 +6268,7 @@
               <a:graphicData uri="http://schemas.openxmlformats.org/drawingml/2006/picture">
                 <pic:pic>
                   <pic:nvPicPr>
-                    <pic:cNvPr id="0" name="er-diagram.png"/>
+                    <pic:cNvPr id="0" name="ui-03-signin.png"/>
                     <pic:cNvPicPr/>
                   </pic:nvPicPr>
                   <pic:blipFill>
@@ -6114,7 +6280,7 @@
                   <pic:spPr>
                     <a:xfrm>
                       <a:off x="0" y="0"/>
-                      <a:ext cx="5040000" cy="3240000"/>
+                      <a:ext cx="5040000" cy="3150000"/>
                     </a:xfrm>
                     <a:prstGeom prst="rect"/>
                   </pic:spPr>
@@ -6138,205 +6304,27 @@
           <w:sz w:val="22"/>
           <w:szCs w:val="22"/>
         </w:rPr>
-        <w:t>Figure: EasyCircular MongoDB ER-style data model</w:t>
-      </w:r>
-    </w:p>
-    <w:p>
-      <w:pPr>
-        <w:pStyle w:val="Heading2"/>
-        <w:spacing w:before="160" w:after="120"/>
-      </w:pPr>
-      <w:r>
-        <w:rPr>
-          <w:rFonts w:ascii="Iskoola Pota" w:hAnsi="Iskoola Pota" w:cs="Iskoola Pota" w:eastAsia="Iskoola Pota"/>
-          <w:b/>
-          <w:color w:val="000000"/>
-          <w:sz w:val="28"/>
-          <w:szCs w:val="28"/>
-          <w:bCs/>
-        </w:rPr>
-        <w:t xml:space="preserve">3.5 අතුරුමුහුණත් නිර්මාණය / </w:t>
-      </w:r>
-      <w:r>
-        <w:rPr>
-          <w:rFonts w:ascii="Times New Roman" w:hAnsi="Times New Roman" w:cs="Times New Roman" w:eastAsia="Times New Roman"/>
-          <w:b/>
-          <w:color w:val="000000"/>
-          <w:sz w:val="28"/>
-          <w:szCs w:val="28"/>
-          <w:bCs/>
-        </w:rPr>
-        <w:t>Wireframes (UI design)</w:t>
-      </w:r>
-    </w:p>
-    <w:p>
-      <w:pPr>
-        <w:spacing w:lineRule="auto" w:line="360" w:after="120"/>
-      </w:pPr>
-      <w:r>
-        <w:rPr>
-          <w:rFonts w:ascii="Times New Roman" w:hAnsi="Times New Roman" w:cs="Times New Roman" w:eastAsia="Times New Roman"/>
-          <w:b w:val="0"/>
-          <w:color w:val="000000"/>
-          <w:sz w:val="24"/>
-          <w:szCs w:val="24"/>
-        </w:rPr>
-        <w:t xml:space="preserve">UI design primary research </w:t>
-      </w:r>
-      <w:r>
-        <w:rPr>
-          <w:rFonts w:ascii="Iskoola Pota" w:hAnsi="Iskoola Pota" w:cs="Iskoola Pota" w:eastAsia="Iskoola Pota"/>
-          <w:b w:val="0"/>
-          <w:color w:val="000000"/>
-          <w:sz w:val="24"/>
-          <w:szCs w:val="24"/>
-        </w:rPr>
-        <w:t xml:space="preserve">අවශ්‍යතා මත පදනම් විය: සාරාංශය, </w:t>
-      </w:r>
-      <w:r>
-        <w:rPr>
-          <w:rFonts w:ascii="Times New Roman" w:hAnsi="Times New Roman" w:cs="Times New Roman" w:eastAsia="Times New Roman"/>
-          <w:b w:val="0"/>
-          <w:color w:val="000000"/>
-          <w:sz w:val="24"/>
-          <w:szCs w:val="24"/>
-        </w:rPr>
-        <w:t xml:space="preserve">entity highlighting </w:t>
-      </w:r>
-      <w:r>
-        <w:rPr>
-          <w:rFonts w:ascii="Iskoola Pota" w:hAnsi="Iskoola Pota" w:cs="Iskoola Pota" w:eastAsia="Iskoola Pota"/>
-          <w:b w:val="0"/>
-          <w:color w:val="000000"/>
-          <w:sz w:val="24"/>
-          <w:szCs w:val="24"/>
-        </w:rPr>
-        <w:t xml:space="preserve">සහ සරල </w:t>
-      </w:r>
-      <w:r>
-        <w:rPr>
-          <w:rFonts w:ascii="Times New Roman" w:hAnsi="Times New Roman" w:cs="Times New Roman" w:eastAsia="Times New Roman"/>
-          <w:b w:val="0"/>
-          <w:color w:val="000000"/>
-          <w:sz w:val="24"/>
-          <w:szCs w:val="24"/>
-        </w:rPr>
-        <w:t xml:space="preserve">upload workflow. </w:t>
-      </w:r>
-      <w:r>
-        <w:rPr>
-          <w:rFonts w:ascii="Iskoola Pota" w:hAnsi="Iskoola Pota" w:cs="Iskoola Pota" w:eastAsia="Iskoola Pota"/>
-          <w:b w:val="0"/>
-          <w:color w:val="000000"/>
-          <w:sz w:val="24"/>
-          <w:szCs w:val="24"/>
-        </w:rPr>
-        <w:t xml:space="preserve">ප්‍රධාන තිර: </w:t>
-      </w:r>
-      <w:r>
-        <w:rPr>
-          <w:rFonts w:ascii="Times New Roman" w:hAnsi="Times New Roman" w:cs="Times New Roman" w:eastAsia="Times New Roman"/>
-          <w:b w:val="0"/>
-          <w:color w:val="000000"/>
-          <w:sz w:val="24"/>
-          <w:szCs w:val="24"/>
-        </w:rPr>
-        <w:t xml:space="preserve">Sign-in, Dashboard, PDF Upload </w:t>
-      </w:r>
-      <w:r>
-        <w:rPr>
-          <w:rFonts w:ascii="Iskoola Pota" w:hAnsi="Iskoola Pota" w:cs="Iskoola Pota" w:eastAsia="Iskoola Pota"/>
-          <w:b w:val="0"/>
-          <w:color w:val="000000"/>
-          <w:sz w:val="24"/>
-          <w:szCs w:val="24"/>
-        </w:rPr>
-        <w:t xml:space="preserve">සහ </w:t>
-      </w:r>
-      <w:r>
-        <w:rPr>
-          <w:rFonts w:ascii="Times New Roman" w:hAnsi="Times New Roman" w:cs="Times New Roman" w:eastAsia="Times New Roman"/>
-          <w:b w:val="0"/>
-          <w:color w:val="000000"/>
-          <w:sz w:val="24"/>
-          <w:szCs w:val="24"/>
-        </w:rPr>
-        <w:t xml:space="preserve">Library (workspace) </w:t>
-      </w:r>
-      <w:r>
-        <w:rPr>
-          <w:rFonts w:ascii="Iskoola Pota" w:hAnsi="Iskoola Pota" w:cs="Iskoola Pota" w:eastAsia="Iskoola Pota"/>
-          <w:b w:val="0"/>
-          <w:color w:val="000000"/>
-          <w:sz w:val="24"/>
-          <w:szCs w:val="24"/>
-        </w:rPr>
-        <w:t>වේ.</w:t>
-      </w:r>
-    </w:p>
-    <w:p>
-      <w:pPr>
-        <w:spacing w:lineRule="auto" w:line="360" w:after="120"/>
-      </w:pPr>
-      <w:r>
-        <w:rPr>
-          <w:rFonts w:ascii="Times New Roman" w:hAnsi="Times New Roman" w:cs="Times New Roman" w:eastAsia="Times New Roman"/>
-          <w:b w:val="0"/>
-          <w:color w:val="000000"/>
-          <w:sz w:val="24"/>
-          <w:szCs w:val="24"/>
-        </w:rPr>
-        <w:t xml:space="preserve">Human-in-the-loop text edit step </w:t>
-      </w:r>
-      <w:r>
-        <w:rPr>
-          <w:rFonts w:ascii="Iskoola Pota" w:hAnsi="Iskoola Pota" w:cs="Iskoola Pota" w:eastAsia="Iskoola Pota"/>
-          <w:b w:val="0"/>
-          <w:color w:val="000000"/>
-          <w:sz w:val="24"/>
-          <w:szCs w:val="24"/>
-        </w:rPr>
-        <w:t xml:space="preserve">අනිවාර්ය </w:t>
-      </w:r>
-      <w:r>
-        <w:rPr>
-          <w:rFonts w:ascii="Times New Roman" w:hAnsi="Times New Roman" w:cs="Times New Roman" w:eastAsia="Times New Roman"/>
-          <w:b w:val="0"/>
-          <w:color w:val="000000"/>
-          <w:sz w:val="24"/>
-          <w:szCs w:val="24"/>
-        </w:rPr>
-        <w:t xml:space="preserve">UI flow </w:t>
-      </w:r>
-      <w:r>
-        <w:rPr>
-          <w:rFonts w:ascii="Iskoola Pota" w:hAnsi="Iskoola Pota" w:cs="Iskoola Pota" w:eastAsia="Iskoola Pota"/>
-          <w:b w:val="0"/>
-          <w:color w:val="000000"/>
-          <w:sz w:val="24"/>
-          <w:szCs w:val="24"/>
-        </w:rPr>
-        <w:t xml:space="preserve">එකකි. පහත රූප මගින් නිර්මාණය කළ අතුරුමුහුණත් ඉදිරිපත් කර ඇත; ක්‍රියාත්මක කළ සාරාංශ සහ </w:t>
-      </w:r>
-      <w:r>
-        <w:rPr>
-          <w:rFonts w:ascii="Times New Roman" w:hAnsi="Times New Roman" w:cs="Times New Roman" w:eastAsia="Times New Roman"/>
-          <w:b w:val="0"/>
-          <w:color w:val="000000"/>
-          <w:sz w:val="24"/>
-          <w:szCs w:val="24"/>
-        </w:rPr>
-        <w:t xml:space="preserve">entity highlight </w:t>
-      </w:r>
-      <w:r>
-        <w:rPr>
-          <w:rFonts w:ascii="Iskoola Pota" w:hAnsi="Iskoola Pota" w:cs="Iskoola Pota" w:eastAsia="Iskoola Pota"/>
-          <w:b w:val="0"/>
-          <w:color w:val="000000"/>
-          <w:sz w:val="24"/>
-          <w:szCs w:val="24"/>
-        </w:rPr>
-        <w:t>තිර පරිච්ඡේදය 4 කොටස 4.2 හි ඉදිරිපත් වේ.</w:t>
+        <w:t xml:space="preserve">Figure: Sign-in </w:t>
+      </w:r>
+      <w:r>
+        <w:rPr>
+          <w:rFonts w:ascii="Iskoola Pota" w:hAnsi="Iskoola Pota" w:cs="Iskoola Pota" w:eastAsia="Iskoola Pota"/>
+          <w:b w:val="0"/>
+          <w:color w:val="000000"/>
+          <w:sz w:val="22"/>
+          <w:szCs w:val="22"/>
+        </w:rPr>
+        <w:t>තිරය (</w:t>
+      </w:r>
+      <w:r>
+        <w:rPr>
+          <w:rFonts w:ascii="Times New Roman" w:hAnsi="Times New Roman" w:cs="Times New Roman" w:eastAsia="Times New Roman"/>
+          <w:b w:val="0"/>
+          <w:color w:val="000000"/>
+          <w:sz w:val="22"/>
+          <w:szCs w:val="22"/>
+        </w:rPr>
+        <w:t>email/password + Google)</w:t>
       </w:r>
     </w:p>
     <w:p>
@@ -6355,7 +6343,7 @@
               <a:graphicData uri="http://schemas.openxmlformats.org/drawingml/2006/picture">
                 <pic:pic>
                   <pic:nvPicPr>
-                    <pic:cNvPr id="0" name="ui-03-signin.png"/>
+                    <pic:cNvPr id="0" name="ui-01-dashboard.png"/>
                     <pic:cNvPicPr/>
                   </pic:nvPicPr>
                   <pic:blipFill>
@@ -6391,7 +6379,7 @@
           <w:sz w:val="22"/>
           <w:szCs w:val="22"/>
         </w:rPr>
-        <w:t xml:space="preserve">Figure: Sign-in </w:t>
+        <w:t xml:space="preserve">Figure: EasyCircular Dashboard  </w:t>
       </w:r>
       <w:r>
         <w:rPr>
@@ -6401,17 +6389,7 @@
           <w:sz w:val="22"/>
           <w:szCs w:val="22"/>
         </w:rPr>
-        <w:t>තිරය (</w:t>
-      </w:r>
-      <w:r>
-        <w:rPr>
-          <w:rFonts w:ascii="Times New Roman" w:hAnsi="Times New Roman" w:cs="Times New Roman" w:eastAsia="Times New Roman"/>
-          <w:b w:val="0"/>
-          <w:color w:val="000000"/>
-          <w:sz w:val="22"/>
-          <w:szCs w:val="22"/>
-        </w:rPr>
-        <w:t>email/password + Google)</w:t>
+        <w:t>ප්‍රධාන අතුරුමුහුණත</w:t>
       </w:r>
     </w:p>
     <w:p>
@@ -6430,7 +6408,7 @@
               <a:graphicData uri="http://schemas.openxmlformats.org/drawingml/2006/picture">
                 <pic:pic>
                   <pic:nvPicPr>
-                    <pic:cNvPr id="0" name="ui-01-dashboard.png"/>
+                    <pic:cNvPr id="0" name="ui-02-upload.png"/>
                     <pic:cNvPicPr/>
                   </pic:nvPicPr>
                   <pic:blipFill>
@@ -6466,7 +6444,7 @@
           <w:sz w:val="22"/>
           <w:szCs w:val="22"/>
         </w:rPr>
-        <w:t xml:space="preserve">Figure: EasyCircular Dashboard  </w:t>
+        <w:t xml:space="preserve">Figure: PDF </w:t>
       </w:r>
       <w:r>
         <w:rPr>
@@ -6476,7 +6454,17 @@
           <w:sz w:val="22"/>
           <w:szCs w:val="22"/>
         </w:rPr>
-        <w:t>ප්‍රධාන අතුරුමුහුණත</w:t>
+        <w:t xml:space="preserve">උඩුගත කිරීමේ </w:t>
+      </w:r>
+      <w:r>
+        <w:rPr>
+          <w:rFonts w:ascii="Times New Roman" w:hAnsi="Times New Roman" w:cs="Times New Roman" w:eastAsia="Times New Roman"/>
+          <w:b w:val="0"/>
+          <w:color w:val="000000"/>
+          <w:sz w:val="22"/>
+          <w:szCs w:val="22"/>
+        </w:rPr>
+        <w:t>interface</w:t>
       </w:r>
     </w:p>
     <w:p>
@@ -6495,86 +6483,11 @@
               <a:graphicData uri="http://schemas.openxmlformats.org/drawingml/2006/picture">
                 <pic:pic>
                   <pic:nvPicPr>
-                    <pic:cNvPr id="0" name="ui-02-upload.png"/>
+                    <pic:cNvPr id="0" name="ui-05-documents.png"/>
                     <pic:cNvPicPr/>
                   </pic:nvPicPr>
                   <pic:blipFill>
                     <a:blip r:embed="rId14"/>
-                    <a:stretch>
-                      <a:fillRect/>
-                    </a:stretch>
-                  </pic:blipFill>
-                  <pic:spPr>
-                    <a:xfrm>
-                      <a:off x="0" y="0"/>
-                      <a:ext cx="5040000" cy="3150000"/>
-                    </a:xfrm>
-                    <a:prstGeom prst="rect"/>
-                  </pic:spPr>
-                </pic:pic>
-              </a:graphicData>
-            </a:graphic>
-          </wp:inline>
-        </w:drawing>
-      </w:r>
-    </w:p>
-    <w:p>
-      <w:pPr>
-        <w:spacing w:after="200"/>
-        <w:jc w:val="center"/>
-      </w:pPr>
-      <w:r>
-        <w:rPr>
-          <w:rFonts w:ascii="Times New Roman" w:hAnsi="Times New Roman" w:cs="Times New Roman" w:eastAsia="Times New Roman"/>
-          <w:b w:val="0"/>
-          <w:color w:val="000000"/>
-          <w:sz w:val="22"/>
-          <w:szCs w:val="22"/>
-        </w:rPr>
-        <w:t xml:space="preserve">Figure: PDF </w:t>
-      </w:r>
-      <w:r>
-        <w:rPr>
-          <w:rFonts w:ascii="Iskoola Pota" w:hAnsi="Iskoola Pota" w:cs="Iskoola Pota" w:eastAsia="Iskoola Pota"/>
-          <w:b w:val="0"/>
-          <w:color w:val="000000"/>
-          <w:sz w:val="22"/>
-          <w:szCs w:val="22"/>
-        </w:rPr>
-        <w:t xml:space="preserve">උඩුගත කිරීමේ </w:t>
-      </w:r>
-      <w:r>
-        <w:rPr>
-          <w:rFonts w:ascii="Times New Roman" w:hAnsi="Times New Roman" w:cs="Times New Roman" w:eastAsia="Times New Roman"/>
-          <w:b w:val="0"/>
-          <w:color w:val="000000"/>
-          <w:sz w:val="22"/>
-          <w:szCs w:val="22"/>
-        </w:rPr>
-        <w:t>interface</w:t>
-      </w:r>
-    </w:p>
-    <w:p>
-      <w:pPr>
-        <w:jc w:val="center"/>
-      </w:pPr>
-      <w:r>
-        <w:drawing>
-          <wp:inline xmlns:a="http://schemas.openxmlformats.org/drawingml/2006/main" xmlns:pic="http://schemas.openxmlformats.org/drawingml/2006/picture">
-            <wp:extent cx="5040000" cy="3150000"/>
-            <wp:docPr id="7" name="Picture 7"/>
-            <wp:cNvGraphicFramePr>
-              <a:graphicFrameLocks noChangeAspect="1"/>
-            </wp:cNvGraphicFramePr>
-            <a:graphic>
-              <a:graphicData uri="http://schemas.openxmlformats.org/drawingml/2006/picture">
-                <pic:pic>
-                  <pic:nvPicPr>
-                    <pic:cNvPr id="0" name="ui-05-documents.png"/>
-                    <pic:cNvPicPr/>
-                  </pic:nvPicPr>
-                  <pic:blipFill>
-                    <a:blip r:embed="rId15"/>
                     <a:stretch>
                       <a:fillRect/>
                     </a:stretch>

</xml_diff>